<commit_message>
Por que escribimos asi: respuestas a las dudas de gerencia (llamada al fijo, garantia vs promesa, seguimientos, correo del dominio, Ley 2300 y RNE en lenguaje simple)
Co-Authored-By: Claude Fable 5.1 <noreply@anthropic.com>
</commit_message>
<xml_diff>
--- a/recursos/comercial/INDUCCION_COMERCIAL/contratacion comercial/POR_QUE_ESCRIBIMOS_ASI_EMPRESAS.docx
+++ b/recursos/comercial/INDUCCION_COMERCIAL/contratacion comercial/POR_QUE_ESCRIBIMOS_ASI_EMPRESAS.docx
@@ -243,7 +243,7 @@
                 <w:b w:val="0"/>
                 <w:sz w:val="17"/>
               </w:rPr>
-              <w:t>Eso es la pedagogía de adentro, y por escrito suena a promesa de resultado, que no hacemos. En la reunión sí se cuenta, con la causa, en un minuto.</w:t>
+              <w:t>Eso es la pedagogía de adentro. Y hay una diferencia con la garantía: la garantía compromete lo que hacemos nosotros si la persona cumple y no avanza, con condiciones y por escrito. Decir que el programa desarrolla liderazgo u orientación al logro es prometer un resultado que no medimos ni garantizamos. En la reunión sí se cuenta, con la causa, en un minuto.</w:t>
             </w:r>
           </w:p>
         </w:tc>
@@ -279,7 +279,7 @@
                 <w:b w:val="0"/>
                 <w:sz w:val="17"/>
               </w:rPr>
-              <w:t>En 304.174 correos, en frío ganó la pregunta de interés; con la conversación ya abierta ganó proponer día y hora. "¿Podríamos agendar una breve conversación?" no ganó en ninguna etapa (Gong Labs, 2020). Por eso el kit se ajusta: dos fechas, sí, pero desde el segundo toque.</w:t>
+              <w:t>En 304.174 correos, en frío ganó la pregunta de interés; con la conversación ya abierta ganó proponer día y hora. "¿Podríamos agendar una breve conversación?" no ganó en ninguna etapa (Gong Labs, 2020). Por eso el kit se ajusta: dos fechas, sí, pero desde el segundo toque. Si le interesa y no contesta, lo recogen los seguimientos: el segundo correo trae las dos fechas y el tercero es la llamada; por eso la secuencia no para hasta el cuarto toque.</w:t>
             </w:r>
           </w:p>
         </w:tc>
@@ -351,7 +351,7 @@
                 <w:b w:val="0"/>
                 <w:sz w:val="17"/>
               </w:rPr>
-              <w:t>El dominio propio responde el doble que un correo gratuito (Hunter, 2025, 31 millones de correos). Los adjuntos afectan la entrega.</w:t>
+              <w:t>El dominio propio responde el doble que un correo gratuito (Hunter, 2025, 31 millones de correos). Los adjuntos afectan la entrega. Por eso el cargo escribe desde una cuenta del dominio de la academia (alianzas@heiiu.com), nunca desde un correo personal.</w:t>
             </w:r>
           </w:p>
         </w:tc>
@@ -423,7 +423,7 @@
                 <w:b w:val="0"/>
                 <w:sz w:val="17"/>
               </w:rPr>
-              <w:t>Ley 2300 y Registro de Números Excluidos. Si aplican a un gerente contactado para un convenio está pendiente de abogado; mientras tanto cumplimos como si aplicaran.</w:t>
+              <w:t>La Ley 2300 limita el horario y la frecuencia del contacto comercial a consumidores, y el Registro de Números Excluidos es la lista donde la gente se inscribe para que no la llamen a vender; hay que consultarlo antes de contactar. Si un gerente, contactado en su oficina por un convenio para su empresa, cuenta como "consumidor" no está resuelto (pendiente de abogado). Mientras tanto cumplimos como si sí: horarios, un contacto al día, un canal por semana, y el registro solo para celulares personales. Llamar al teléfono publicado de la empresa sí se puede.</w:t>
             </w:r>
           </w:p>
         </w:tc>
@@ -456,7 +456,7 @@
           <w:b w:val="0"/>
           <w:sz w:val="19"/>
         </w:rPr>
-        <w:t>Cuántas empresas de Bucaramanga responden a un correo así, cuántas a una llamada y cuántas a una visita. La meta de arranque es entre 5% y 10% de respuesta y una reunión por cada 8 a 12 empresas que completen los cuatro toques; es un supuesto, y en cuatro semanas el tablero dice si es verdad. Por eso cada toque se anota el mismo día: sin registro no hay forma de aprender.</w:t>
+        <w:t>Cuántas empresas de Bucaramanga responden a un correo así, cuántas a una llamada al teléfono publicado de la empresa y cuántas a una visita. La meta de arranque es entre 5% y 10% de respuesta y una reunión por cada 8 a 12 empresas que completen los cuatro toques; es un supuesto, y en cuatro semanas el tablero dice si es verdad. Por eso cada toque se anota el mismo día: sin registro no hay forma de aprender.</w:t>
       </w:r>
     </w:p>
     <w:tbl>

</xml_diff>

<commit_message>
Por que escribimos asi: reporte como argumento de reunion (cualidades que desde arriba no se notan, hijo de empleado como candidato), premiar/retener, salida solo en el cierre
Co-Authored-By: Claude Fable 5.1 <noreply@anthropic.com>
</commit_message>
<xml_diff>
--- a/recursos/comercial/INDUCCION_COMERCIAL/contratacion comercial/POR_QUE_ESCRIBIMOS_ASI_EMPRESAS.docx
+++ b/recursos/comercial/INDUCCION_COMERCIAL/contratacion comercial/POR_QUE_ESCRIBIMOS_ASI_EMPRESAS.docx
@@ -27,19 +27,11 @@
           <w:lang w:val="es-CO"/>
         </w:rPr>
       </w:pPr>
-      <w:proofErr w:type="spellStart"/>
       <w:r>
         <w:rPr>
           <w:lang w:val="es-CO"/>
         </w:rPr>
-        <w:t>Jhon</w:t>
-      </w:r>
-      <w:proofErr w:type="spellEnd"/>
-      <w:r>
-        <w:rPr>
-          <w:lang w:val="es-CO"/>
-        </w:rPr>
-        <w:t xml:space="preserve"> primero que todo super el </w:t>
+        <w:t xml:space="preserve">Jhon primero que todo super el </w:t>
       </w:r>
       <w:r>
         <w:rPr>
@@ -65,14 +57,12 @@
         </w:rPr>
         <w:t xml:space="preserve">realmente me parece que </w:t>
       </w:r>
-      <w:proofErr w:type="spellStart"/>
       <w:r>
         <w:rPr>
           <w:lang w:val="es-CO"/>
         </w:rPr>
-        <w:t>est</w:t>
+        <w:t>está</w:t>
       </w:r>
-      <w:proofErr w:type="spellEnd"/>
       <w:r>
         <w:rPr>
           <w:lang w:val="es-CO"/>
@@ -85,14 +75,12 @@
         </w:rPr>
         <w:t xml:space="preserve">pero </w:t>
       </w:r>
-      <w:proofErr w:type="spellStart"/>
       <w:r>
         <w:rPr>
           <w:lang w:val="es-CO"/>
         </w:rPr>
-        <w:t>sobretodo</w:t>
+        <w:t>sobre todo</w:t>
       </w:r>
-      <w:proofErr w:type="spellEnd"/>
       <w:r>
         <w:rPr>
           <w:lang w:val="es-CO"/>
@@ -123,47 +111,113 @@
         </w:rPr>
         <w:t xml:space="preserve">e la idea muy clara y es que vendemos </w:t>
       </w:r>
-      <w:proofErr w:type="spellStart"/>
       <w:r>
         <w:rPr>
           <w:lang w:val="es-CO"/>
         </w:rPr>
-        <w:t>mas</w:t>
+        <w:t>más</w:t>
       </w:r>
-      <w:proofErr w:type="spellEnd"/>
       <w:r>
         <w:rPr>
           <w:lang w:val="es-CO"/>
         </w:rPr>
         <w:t xml:space="preserve"> que el </w:t>
       </w:r>
-      <w:proofErr w:type="spellStart"/>
       <w:r>
         <w:rPr>
           <w:lang w:val="es-CO"/>
         </w:rPr>
-        <w:t>ingles</w:t>
+        <w:t>inglés</w:t>
       </w:r>
-      <w:proofErr w:type="spellEnd"/>
       <w:r>
         <w:rPr>
           <w:lang w:val="es-CO"/>
         </w:rPr>
         <w:t xml:space="preserve"> que todos venden. Pero como me pediste comentarios y sugerencias, yo me puse a hacer una investigación profunda para darte una guía de lo que se consideran buenas </w:t>
       </w:r>
-      <w:proofErr w:type="spellStart"/>
       <w:r>
         <w:rPr>
           <w:lang w:val="es-CO"/>
         </w:rPr>
-        <w:t>practicas</w:t>
+        <w:t>prácticas</w:t>
       </w:r>
-      <w:proofErr w:type="spellEnd"/>
       <w:r>
         <w:rPr>
           <w:lang w:val="es-CO"/>
         </w:rPr>
-        <w:t xml:space="preserve"> a la hora de enviar correos a altos directivos porque por lo general lo que tiene a fallar cuando se hacen envíos en frio es que lo que a nosotros nos parece bien y completo, al gerente le parece largo y no lo termina leyendo. Lo cual no nos sirve por que perdemos el primer intento. Entonces aquí van las sugerencias y lo que encontré y ya con eso decides tambien tu como lo terminas de organizar</w:t>
+        <w:t xml:space="preserve"> a la hora de enviar correos a altos directivos porque por lo general</w:t>
+      </w:r>
+      <w:r>
+        <w:rPr>
+          <w:lang w:val="es-CO"/>
+        </w:rPr>
+        <w:t xml:space="preserve"> yo como gerente poco los leo y muchas veces no los abro. Entonces poniéndome desde esa posición,</w:t>
+      </w:r>
+      <w:r>
+        <w:rPr>
+          <w:lang w:val="es-CO"/>
+        </w:rPr>
+        <w:t xml:space="preserve"> lo que </w:t>
+      </w:r>
+      <w:r>
+        <w:rPr>
+          <w:lang w:val="es-CO"/>
+        </w:rPr>
+        <w:t xml:space="preserve">creo que </w:t>
+      </w:r>
+      <w:r>
+        <w:rPr>
+          <w:lang w:val="es-CO"/>
+        </w:rPr>
+        <w:t>tien</w:t>
+      </w:r>
+      <w:r>
+        <w:rPr>
+          <w:lang w:val="es-CO"/>
+        </w:rPr>
+        <w:t>d</w:t>
+      </w:r>
+      <w:r>
+        <w:rPr>
+          <w:lang w:val="es-CO"/>
+        </w:rPr>
+        <w:t xml:space="preserve">e a fallar </w:t>
+      </w:r>
+      <w:r>
+        <w:rPr>
+          <w:lang w:val="es-CO"/>
+        </w:rPr>
+        <w:t xml:space="preserve">es que </w:t>
+      </w:r>
+      <w:r>
+        <w:rPr>
+          <w:lang w:val="es-CO"/>
+        </w:rPr>
+        <w:t xml:space="preserve">cuando </w:t>
+      </w:r>
+      <w:r>
+        <w:rPr>
+          <w:lang w:val="es-CO"/>
+        </w:rPr>
+        <w:t>uno</w:t>
+      </w:r>
+      <w:r>
+        <w:rPr>
+          <w:lang w:val="es-CO"/>
+        </w:rPr>
+        <w:t xml:space="preserve"> hace envíos en frio </w:t>
+      </w:r>
+      <w:r>
+        <w:rPr>
+          <w:lang w:val="es-CO"/>
+        </w:rPr>
+        <w:t xml:space="preserve">como vendedor </w:t>
+      </w:r>
+      <w:r>
+        <w:rPr>
+          <w:lang w:val="es-CO"/>
+        </w:rPr>
+        <w:t>es que lo que a nosotros nos parece bien y completo, al gerente le parece largo y no lo termina leyendo. Lo cual no nos sirve por que perdemos el primer intento. Entonces aquí van las sugerencias y lo que encontré y ya con eso decides tambien tu como lo terminas de organizar</w:t>
       </w:r>
       <w:r>
         <w:rPr>
@@ -206,34 +260,14 @@
             <w:shd w:val="clear" w:color="auto" w:fill="E54C09"/>
           </w:tcPr>
           <w:p>
-            <w:proofErr w:type="spellStart"/>
             <w:r>
               <w:rPr>
                 <w:b/>
                 <w:color w:val="FFFFFF"/>
                 <w:sz w:val="17"/>
               </w:rPr>
-              <w:t>Cómo</w:t>
+              <w:t>Cómo lo hacemos</w:t>
             </w:r>
-            <w:proofErr w:type="spellEnd"/>
-            <w:r>
-              <w:rPr>
-                <w:b/>
-                <w:color w:val="FFFFFF"/>
-                <w:sz w:val="17"/>
-              </w:rPr>
-              <w:t xml:space="preserve"> lo </w:t>
-            </w:r>
-            <w:proofErr w:type="spellStart"/>
-            <w:r>
-              <w:rPr>
-                <w:b/>
-                <w:color w:val="FFFFFF"/>
-                <w:sz w:val="17"/>
-              </w:rPr>
-              <w:t>hacemos</w:t>
-            </w:r>
-            <w:proofErr w:type="spellEnd"/>
           </w:p>
         </w:tc>
         <w:tc>
@@ -306,37 +340,7 @@
                 <w:sz w:val="17"/>
                 <w:lang w:val="es-CO"/>
               </w:rPr>
-              <w:t xml:space="preserve">Asunto corto con el nombre de la empresa, y el correo con el nombre y cargo de quien decide. </w:t>
-            </w:r>
-            <w:r>
-              <w:rPr>
-                <w:b/>
-                <w:sz w:val="17"/>
-              </w:rPr>
-              <w:t>Nunca</w:t>
-            </w:r>
-            <w:r>
-              <w:rPr>
-                <w:b/>
-                <w:sz w:val="17"/>
-              </w:rPr>
-              <w:t xml:space="preserve"> nada </w:t>
-            </w:r>
-            <w:proofErr w:type="spellStart"/>
-            <w:r>
-              <w:rPr>
-                <w:b/>
-                <w:sz w:val="17"/>
-              </w:rPr>
-              <w:t>generico</w:t>
-            </w:r>
-            <w:proofErr w:type="spellEnd"/>
-            <w:r>
-              <w:rPr>
-                <w:b/>
-                <w:sz w:val="17"/>
-              </w:rPr>
-              <w:t xml:space="preserve">, </w:t>
+              <w:t>La primera línea habla de su empresa; la segunda, de lo que gana: becas con el nombre de su empresa, sin costo para la empresa, con las que puede premiar y retener a su gente.</w:t>
             </w:r>
           </w:p>
         </w:tc>
@@ -355,39 +359,7 @@
                 <w:sz w:val="17"/>
                 <w:lang w:val="es-CO"/>
               </w:rPr>
-              <w:t xml:space="preserve">Poner el nombre en el asunto subió la apertura 20% y los contactos de venta 31% en experimentos con grupos de control (Sahni, Wheeler y </w:t>
-            </w:r>
-            <w:proofErr w:type="spellStart"/>
-            <w:r>
-              <w:rPr>
-                <w:sz w:val="17"/>
-                <w:lang w:val="es-CO"/>
-              </w:rPr>
-              <w:t>Chintagunta</w:t>
-            </w:r>
-            <w:proofErr w:type="spellEnd"/>
-            <w:r>
-              <w:rPr>
-                <w:sz w:val="17"/>
-                <w:lang w:val="es-CO"/>
-              </w:rPr>
-              <w:t xml:space="preserve">, Marketing </w:t>
-            </w:r>
-            <w:proofErr w:type="spellStart"/>
-            <w:r>
-              <w:rPr>
-                <w:sz w:val="17"/>
-                <w:lang w:val="es-CO"/>
-              </w:rPr>
-              <w:t>Science</w:t>
-            </w:r>
-            <w:proofErr w:type="spellEnd"/>
-            <w:r>
-              <w:rPr>
-                <w:sz w:val="17"/>
-                <w:lang w:val="es-CO"/>
-              </w:rPr>
-              <w:t>, 2018). Un correo sin nombre se lee como masivo y se borra.</w:t>
+              <w:t>Poner el nombre en el asunto subió la apertura 20% y los contactos de venta 31% en experimentos con grupos de control (Sahni, Wheeler y Chintagunta, Marketing Science, 2018). Un correo sin nombre se lee como masivo y se borra.</w:t>
             </w:r>
           </w:p>
         </w:tc>
@@ -428,23 +400,7 @@
                 <w:sz w:val="17"/>
                 <w:lang w:val="es-CO"/>
               </w:rPr>
-              <w:t xml:space="preserve">Lo centrado en el producto baja la respuesta (Gong, 2026). Y en Colombia el 75% de las empresas no da ningún beneficio extrasalarial y la mitad no mide los que da (ACRIP 2024; </w:t>
-            </w:r>
-            <w:proofErr w:type="spellStart"/>
-            <w:r>
-              <w:rPr>
-                <w:sz w:val="17"/>
-                <w:lang w:val="es-CO"/>
-              </w:rPr>
-              <w:t>elempleo</w:t>
-            </w:r>
-            <w:proofErr w:type="spellEnd"/>
-            <w:r>
-              <w:rPr>
-                <w:sz w:val="17"/>
-                <w:lang w:val="es-CO"/>
-              </w:rPr>
-              <w:t>). Lo que abre la puerta no es el inglés: es un beneficio que no cuesta y que se puede mostrar.</w:t>
+              <w:t>Lo centrado en el producto baja la respuesta (Gong, 2026). Y en Colombia el 75% de las empresas no da ningún beneficio extrasalarial y la mitad no mide los que da (ACRIP 2024; elempleo). Lo que abre la puerta no es el inglés: es un beneficio que no cuesta y que se puede mostrar.</w:t>
             </w:r>
           </w:p>
         </w:tc>
@@ -485,22 +441,8 @@
                 <w:sz w:val="17"/>
                 <w:lang w:val="es-CO"/>
               </w:rPr>
-              <w:t>Sí somos distintos por eso, y sí se dice: junto con el inglés se entrenan puntualidad, constancia y disciplina, y eso se le puede reportar a la empresa. Lo que no va en el primer correo es la lista de once competencias y cuatro virtudes: en 9 segundos de lectura se vuelve catálogo y se lee como promesa. Va en una frase ("y usted ve en el reporte su asistencia, puntualidad y cumplimiento"); la lista completa se cuenta en la reunión, con la causa, en un minuto. Cuando esos hábitos estén en indicadores, el reporte a la empresa los incluye.</w:t>
+              <w:t>Sí somos distintos por eso, y sí se dice: junto con el inglés se entrenan puntualidad, constancia y disciplina, y eso se le puede reportar a la empresa. Lo que no va en el primer correo es la lista de once competencias y cuatro virtudes: en 9 segundos de lectura se vuelve catálogo y se lee como promesa. En la reunión va en una frase: "usted ve en el reporte su asistencia, puntualidad y cumplimiento", que vale porque el gerente ve cualidades que desde arriba poco se notan, y si el becado es el hijo de un empleado, un posible candidato para sus vacantes. La lista completa se cuenta con la causa, en un minuto. Cuando esos hábitos estén en indicadores, el reporte a la empresa los incluye.</w:t>
             </w:r>
-            <w:proofErr w:type="spellStart"/>
-            <w:proofErr w:type="spellEnd"/>
-            <w:proofErr w:type="spellStart"/>
-            <w:proofErr w:type="spellEnd"/>
-            <w:proofErr w:type="spellStart"/>
-            <w:proofErr w:type="spellEnd"/>
-            <w:proofErr w:type="spellStart"/>
-            <w:proofErr w:type="spellEnd"/>
-            <w:proofErr w:type="spellStart"/>
-            <w:proofErr w:type="spellEnd"/>
-            <w:proofErr w:type="spellStart"/>
-            <w:proofErr w:type="spellEnd"/>
-            <w:proofErr w:type="spellStart"/>
-            <w:proofErr w:type="spellEnd"/>
           </w:p>
         </w:tc>
       </w:tr>
@@ -564,23 +506,7 @@
                 <w:b/>
                 <w:sz w:val="17"/>
               </w:rPr>
-              <w:t xml:space="preserve">Cada uno </w:t>
-            </w:r>
-            <w:proofErr w:type="spellStart"/>
-            <w:r>
-              <w:rPr>
-                <w:b/>
-                <w:sz w:val="17"/>
-              </w:rPr>
-              <w:t>trae</w:t>
-            </w:r>
-            <w:proofErr w:type="spellEnd"/>
-            <w:r>
-              <w:rPr>
-                <w:b/>
-                <w:sz w:val="17"/>
-              </w:rPr>
-              <w:t xml:space="preserve"> algo nuevo.</w:t>
+              <w:t>Cada uno trae algo nuevo.</w:t>
             </w:r>
           </w:p>
         </w:tc>
@@ -599,55 +525,7 @@
                 <w:sz w:val="17"/>
                 <w:lang w:val="es-CO"/>
               </w:rPr>
-              <w:t>Entre el 42% y el 59% de las respuestas llega en los seguimientos (</w:t>
-            </w:r>
-            <w:proofErr w:type="spellStart"/>
-            <w:r>
-              <w:rPr>
-                <w:sz w:val="17"/>
-                <w:lang w:val="es-CO"/>
-              </w:rPr>
-              <w:t>Instantly</w:t>
-            </w:r>
-            <w:proofErr w:type="spellEnd"/>
-            <w:r>
-              <w:rPr>
-                <w:sz w:val="17"/>
-                <w:lang w:val="es-CO"/>
-              </w:rPr>
-              <w:t xml:space="preserve"> y </w:t>
-            </w:r>
-            <w:proofErr w:type="spellStart"/>
-            <w:r>
-              <w:rPr>
-                <w:sz w:val="17"/>
-                <w:lang w:val="es-CO"/>
-              </w:rPr>
-              <w:t>Belkins</w:t>
-            </w:r>
-            <w:proofErr w:type="spellEnd"/>
-            <w:r>
-              <w:rPr>
-                <w:sz w:val="17"/>
-                <w:lang w:val="es-CO"/>
-              </w:rPr>
-              <w:t>, 2026). Un seguimiento sube las respuestas 66% (</w:t>
-            </w:r>
-            <w:proofErr w:type="spellStart"/>
-            <w:r>
-              <w:rPr>
-                <w:sz w:val="17"/>
-                <w:lang w:val="es-CO"/>
-              </w:rPr>
-              <w:t>Backlinko</w:t>
-            </w:r>
-            <w:proofErr w:type="spellEnd"/>
-            <w:r>
-              <w:rPr>
-                <w:sz w:val="17"/>
-                <w:lang w:val="es-CO"/>
-              </w:rPr>
-              <w:t>). Más de cuatro toques solo suben las quejas.</w:t>
+              <w:t>Entre el 42% y el 59% de las respuestas llega en los seguimientos (Instantly y Belkins, 2026). Un seguimiento sube las respuestas 66% (Backlinko). Más de cuatro toques solo suben las quejas.</w:t>
             </w:r>
           </w:p>
         </w:tc>
@@ -688,10 +566,22 @@
                 <w:sz w:val="17"/>
                 <w:lang w:val="es-CO"/>
               </w:rPr>
-              <w:t>El dominio propio responde el doble que un correo gratuito (Hunter, 2025, 31 millones de correos). Los adjuntos afectan la entrega. Por eso el cargo escribe desde la cuenta institucional ger.alianzas@heiiu.com, que coordinación entrega mañana con su clave.</w:t>
+              <w:t xml:space="preserve">El dominio propio responde el doble que un correo gratuito (Hunter, 2025, 31 millones de correos). Los adjuntos afectan la entrega. Por eso el cargo escribe desde la cuenta institucional ger.alianzas@heiiu.com, que </w:t>
             </w:r>
-            <w:proofErr w:type="gramStart"/>
-            <w:proofErr w:type="gramEnd"/>
+            <w:r>
+              <w:rPr>
+                <w:sz w:val="17"/>
+                <w:lang w:val="es-CO"/>
+              </w:rPr>
+              <w:t>Jacque le</w:t>
+            </w:r>
+            <w:r>
+              <w:rPr>
+                <w:sz w:val="17"/>
+                <w:lang w:val="es-CO"/>
+              </w:rPr>
+              <w:t xml:space="preserve"> entrega mañana con su clave.</w:t>
+            </w:r>
           </w:p>
         </w:tc>
       </w:tr>
@@ -731,10 +621,22 @@
                 <w:sz w:val="17"/>
                 <w:lang w:val="es-CO"/>
               </w:rPr>
-              <w:t>La política de WhatsApp (Meta, septiembre de 2026) exige número y permiso; sin eso se arriesga la línea. Además, el celular personal de un gerente es dato personal (Ley 1581). Si ya hubo contacto y la persona dio su número (en una reunión, con su tarjeta o escribiendo primero), sí se le puede escribir por WhatsApp.</w:t>
+              <w:t>La política de WhatsApp (Meta, septiembre de 2026) exige número y permiso; sin eso se arriesga la línea. Además, el celular personal de un gerente es dato personal (Ley 1581). Si ya hubo contacto</w:t>
             </w:r>
-            <w:proofErr w:type="gramStart"/>
-            <w:proofErr w:type="gramEnd"/>
+            <w:r>
+              <w:rPr>
+                <w:sz w:val="17"/>
+                <w:lang w:val="es-CO"/>
+              </w:rPr>
+              <w:t xml:space="preserve"> por los anteriores trabajos</w:t>
+            </w:r>
+            <w:r>
+              <w:rPr>
+                <w:sz w:val="17"/>
+                <w:lang w:val="es-CO"/>
+              </w:rPr>
+              <w:t xml:space="preserve"> y la persona dio su número (en una reunión, con su tarjeta o escribiendo primero), sí se le puede escribir por WhatsApp.</w:t>
+            </w:r>
           </w:p>
         </w:tc>
       </w:tr>
@@ -755,7 +657,7 @@
                 <w:sz w:val="17"/>
                 <w:lang w:val="es-CO"/>
               </w:rPr>
-              <w:t>Correo en horario laboral; llamadas y WhatsApp con horario, un contacto al día y salida en cada mensaje.</w:t>
+              <w:t>Correo en horario laboral; llamadas y WhatsApp con horario y un contacto al día; la línea de salida solo en el cierre.</w:t>
             </w:r>
           </w:p>
         </w:tc>
@@ -776,8 +678,6 @@
               </w:rPr>
               <w:t>Para el correo basta con enviarlo en horario laboral: el gerente lo abre cuando quiere. Las normas de horario y frecuencia (Ley 2300) y el Registro de Números Excluidos pesan en la llamada y en el WhatsApp: horario de oficina, un contacto al día y el registro solo para celulares personales. Llamar al teléfono publicado de la empresa sí se puede.</w:t>
             </w:r>
-            <w:proofErr w:type="spellStart"/>
-            <w:proofErr w:type="spellEnd"/>
           </w:p>
         </w:tc>
       </w:tr>
@@ -848,8 +748,6 @@
               </w:rPr>
               <w:t>Si en la calle algo contradice esta hoja (una empresa que respondió a la llamada y no al correo, una que pidió la propuesta por WhatsApp), se anota en el tablero y se trae al seguimiento. Las reglas salieron de datos; con datos nuestros se cambian.</w:t>
             </w:r>
-            <w:proofErr w:type="gramStart"/>
-            <w:proofErr w:type="gramEnd"/>
           </w:p>
         </w:tc>
       </w:tr>

</xml_diff>